<commit_message>
add precise storage layer
</commit_message>
<xml_diff>
--- a/docs/znaniya.docx
+++ b/docs/znaniya.docx
@@ -2466,112 +2466,2429 @@
     <w:p>
       <w:pPr>
         <w:pStyle w:val="ListBullet"/>
-        <w:spacing w:before="20" w:after="40"/>
       </w:pPr>
       <w:r>
-        <w:rPr>
-          <w:rFonts w:ascii="Arial" w:hAnsi="Arial"/>
-          <w:b/>
-          <w:sz w:val="19"/>
-        </w:rPr>
-        <w:t xml:space="preserve">Технологии: </w:t>
-      </w:r>
-      <w:r>
-        <w:rPr>
-          <w:rFonts w:ascii="Arial" w:hAnsi="Arial"/>
-          <w:sz w:val="19"/>
-        </w:rPr>
-        <w:t>PostgreSQL с партиционированием таблиц по временным интервалам (timeseries partitioning).</w:t>
+        <w:t>Технологии: PostgreSQL 16 с обязательным партиционированием таблиц временных рядов по временным интервалам.</w:t>
       </w:r>
     </w:p>
     <w:p>
       <w:pPr>
-        <w:pStyle w:val="ListBullet2"/>
-        <w:spacing w:before="20" w:after="40"/>
+        <w:pStyle w:val="ListBullet"/>
       </w:pPr>
       <w:r>
-        <w:rPr>
-          <w:rFonts w:ascii="Consolas" w:hAnsi="Consolas"/>
-          <w:b/>
-          <w:color w:val="1B365D"/>
-          <w:sz w:val="18"/>
-        </w:rPr>
-        <w:t xml:space="preserve">market_data: </w:t>
-      </w:r>
-      <w:r>
-        <w:rPr>
-          <w:rFonts w:ascii="Arial" w:hAnsi="Arial"/>
-          <w:sz w:val="19"/>
-        </w:rPr>
-        <w:t>Временные ряды спотовых тарифов и объёмов генерации по энергозонам.</w:t>
+        <w:t>Схема хранения данных (в соответствии со спецификацией PreColumns.md):</w:t>
       </w:r>
     </w:p>
     <w:p>
-      <w:pPr>
-        <w:pStyle w:val="ListBullet2"/>
-        <w:spacing w:before="20" w:after="40"/>
-      </w:pPr>
       <w:r>
         <w:rPr>
-          <w:rFonts w:ascii="Consolas" w:hAnsi="Consolas"/>
           <w:b/>
-          <w:color w:val="1B365D"/>
-          <w:sz w:val="18"/>
         </w:rPr>
-        <w:t xml:space="preserve">weather_data: </w:t>
-      </w:r>
-      <w:r>
-        <w:rPr>
-          <w:rFonts w:ascii="Arial" w:hAnsi="Arial"/>
-          <w:sz w:val="19"/>
-        </w:rPr>
-        <w:t>Временные ряды температуры, влажности и скорости ветра в локациях дата-центров.</w:t>
+        <w:t>1. Таблица спотовых цен: market_day_ahead_prices (ENTSO-E Day-Ahead Prices)</w:t>
       </w:r>
     </w:p>
     <w:p>
-      <w:pPr>
-        <w:pStyle w:val="ListBullet2"/>
-        <w:spacing w:before="20" w:after="40"/>
-      </w:pPr>
       <w:r>
         <w:rPr>
-          <w:rFonts w:ascii="Consolas" w:hAnsi="Consolas"/>
-          <w:b/>
-          <w:color w:val="1B365D"/>
-          <w:sz w:val="18"/>
+          <w:i/>
         </w:rPr>
-        <w:t xml:space="preserve">client_infrastructure: </w:t>
+        <w:t>Назначение: спотовые цены на электроэнергию по энергозонам. Партиционирование: RANGE по period_start (1 месяц).</w:t>
       </w:r>
+    </w:p>
+    <w:tbl>
+      <w:tblPr>
+        <w:tblStyle w:val="TableGrid"/>
+        <w:tblW w:type="auto" w:w="0"/>
+        <w:tblLook w:firstColumn="1" w:firstRow="1" w:lastColumn="0" w:lastRow="0" w:noHBand="0" w:noVBand="1" w:val="04A0"/>
+      </w:tblPr>
+      <w:tblGrid>
+        <w:gridCol w:w="3213"/>
+        <w:gridCol w:w="3213"/>
+        <w:gridCol w:w="3213"/>
+      </w:tblGrid>
+      <w:tr>
+        <w:tc>
+          <w:tcPr>
+            <w:tcW w:type="dxa" w:w="3213"/>
+          </w:tcPr>
+          <w:p>
+            <w:r>
+              <w:rPr>
+                <w:b/>
+              </w:rPr>
+              <w:t>Поле</w:t>
+            </w:r>
+          </w:p>
+        </w:tc>
+        <w:tc>
+          <w:tcPr>
+            <w:tcW w:type="dxa" w:w="3213"/>
+          </w:tcPr>
+          <w:p>
+            <w:r>
+              <w:rPr>
+                <w:b/>
+              </w:rPr>
+              <w:t>Бизнес-название</w:t>
+            </w:r>
+          </w:p>
+        </w:tc>
+        <w:tc>
+          <w:tcPr>
+            <w:tcW w:type="dxa" w:w="3213"/>
+          </w:tcPr>
+          <w:p>
+            <w:r>
+              <w:rPr>
+                <w:b/>
+              </w:rPr>
+              <w:t>Пояснение</w:t>
+            </w:r>
+          </w:p>
+        </w:tc>
+      </w:tr>
+      <w:tr>
+        <w:tc>
+          <w:tcPr>
+            <w:tcW w:type="dxa" w:w="3213"/>
+          </w:tcPr>
+          <w:p>
+            <w:r>
+              <w:t>bidding_zone</w:t>
+            </w:r>
+          </w:p>
+        </w:tc>
+        <w:tc>
+          <w:tcPr>
+            <w:tcW w:type="dxa" w:w="3213"/>
+          </w:tcPr>
+          <w:p>
+            <w:r>
+              <w:t>Энергозона</w:t>
+            </w:r>
+          </w:p>
+        </w:tc>
+        <w:tc>
+          <w:tcPr>
+            <w:tcW w:type="dxa" w:w="3213"/>
+          </w:tcPr>
+          <w:p>
+            <w:r>
+              <w:t>По нему сравниваем географические локации</w:t>
+            </w:r>
+          </w:p>
+        </w:tc>
+      </w:tr>
+      <w:tr>
+        <w:tc>
+          <w:tcPr>
+            <w:tcW w:type="dxa" w:w="3213"/>
+          </w:tcPr>
+          <w:p>
+            <w:r>
+              <w:t>period_start</w:t>
+            </w:r>
+          </w:p>
+        </w:tc>
+        <w:tc>
+          <w:tcPr>
+            <w:tcW w:type="dxa" w:w="3213"/>
+          </w:tcPr>
+          <w:p>
+            <w:r>
+              <w:t>Начало ценового интервала</w:t>
+            </w:r>
+          </w:p>
+        </w:tc>
+        <w:tc>
+          <w:tcPr>
+            <w:tcW w:type="dxa" w:w="3213"/>
+          </w:tcPr>
+          <w:p>
+            <w:r>
+              <w:t>Начало интервала, для которого действует цена</w:t>
+            </w:r>
+          </w:p>
+        </w:tc>
+      </w:tr>
+      <w:tr>
+        <w:tc>
+          <w:tcPr>
+            <w:tcW w:type="dxa" w:w="3213"/>
+          </w:tcPr>
+          <w:p>
+            <w:r>
+              <w:t>period_end</w:t>
+            </w:r>
+          </w:p>
+        </w:tc>
+        <w:tc>
+          <w:tcPr>
+            <w:tcW w:type="dxa" w:w="3213"/>
+          </w:tcPr>
+          <w:p>
+            <w:r>
+              <w:t>Конец ценового интервала</w:t>
+            </w:r>
+          </w:p>
+        </w:tc>
+        <w:tc>
+          <w:tcPr>
+            <w:tcW w:type="dxa" w:w="3213"/>
+          </w:tcPr>
+          <w:p>
+            <w:r>
+              <w:t>Конец ценового интервала</w:t>
+            </w:r>
+          </w:p>
+        </w:tc>
+      </w:tr>
+      <w:tr>
+        <w:tc>
+          <w:tcPr>
+            <w:tcW w:type="dxa" w:w="3213"/>
+          </w:tcPr>
+          <w:p>
+            <w:r>
+              <w:t>price</w:t>
+            </w:r>
+          </w:p>
+        </w:tc>
+        <w:tc>
+          <w:tcPr>
+            <w:tcW w:type="dxa" w:w="3213"/>
+          </w:tcPr>
+          <w:p>
+            <w:r>
+              <w:t>Цена</w:t>
+            </w:r>
+          </w:p>
+        </w:tc>
+        <w:tc>
+          <w:tcPr>
+            <w:tcW w:type="dxa" w:w="3213"/>
+          </w:tcPr>
+          <w:p>
+            <w:r>
+              <w:t>Цена электроэнергии — основной показатель оптимизации</w:t>
+            </w:r>
+          </w:p>
+        </w:tc>
+      </w:tr>
+      <w:tr>
+        <w:tc>
+          <w:tcPr>
+            <w:tcW w:type="dxa" w:w="3213"/>
+          </w:tcPr>
+          <w:p>
+            <w:r>
+              <w:t>currency</w:t>
+            </w:r>
+          </w:p>
+        </w:tc>
+        <w:tc>
+          <w:tcPr>
+            <w:tcW w:type="dxa" w:w="3213"/>
+          </w:tcPr>
+          <w:p>
+            <w:r>
+              <w:t>Валюта</w:t>
+            </w:r>
+          </w:p>
+        </w:tc>
+        <w:tc>
+          <w:tcPr>
+            <w:tcW w:type="dxa" w:w="3213"/>
+          </w:tcPr>
+          <w:p>
+            <w:r>
+              <w:t>Валюта цены, например EUR</w:t>
+            </w:r>
+          </w:p>
+        </w:tc>
+      </w:tr>
+      <w:tr>
+        <w:tc>
+          <w:tcPr>
+            <w:tcW w:type="dxa" w:w="3213"/>
+          </w:tcPr>
+          <w:p>
+            <w:r>
+              <w:t>price_unit</w:t>
+            </w:r>
+          </w:p>
+        </w:tc>
+        <w:tc>
+          <w:tcPr>
+            <w:tcW w:type="dxa" w:w="3213"/>
+          </w:tcPr>
+          <w:p>
+            <w:r>
+              <w:t>Единица измерения цены</w:t>
+            </w:r>
+          </w:p>
+        </w:tc>
+        <w:tc>
+          <w:tcPr>
+            <w:tcW w:type="dxa" w:w="3213"/>
+          </w:tcPr>
+          <w:p>
+            <w:r>
+              <w:t>На какую единицу измерения указана цена (например МВт)</w:t>
+            </w:r>
+          </w:p>
+        </w:tc>
+      </w:tr>
+      <w:tr>
+        <w:tc>
+          <w:tcPr>
+            <w:tcW w:type="dxa" w:w="3213"/>
+          </w:tcPr>
+          <w:p>
+            <w:r>
+              <w:t>resolution</w:t>
+            </w:r>
+          </w:p>
+        </w:tc>
+        <w:tc>
+          <w:tcPr>
+            <w:tcW w:type="dxa" w:w="3213"/>
+          </w:tcPr>
+          <w:p>
+            <w:r>
+              <w:t>Шаг временного ряда</w:t>
+            </w:r>
+          </w:p>
+        </w:tc>
+        <w:tc>
+          <w:tcPr>
+            <w:tcW w:type="dxa" w:w="3213"/>
+          </w:tcPr>
+          <w:p>
+            <w:r>
+              <w:t>Шаг временного ряда, например PT60M или PT15M</w:t>
+            </w:r>
+          </w:p>
+        </w:tc>
+      </w:tr>
+    </w:tbl>
+    <w:p/>
+    <w:p>
       <w:r>
         <w:rPr>
-          <w:rFonts w:ascii="Arial" w:hAnsi="Arial"/>
-          <w:sz w:val="19"/>
+          <w:b/>
         </w:rPr>
-        <w:t>Справочник площадок ЦОД (локация, базовый PUE) и парка оборудования (кВт под нагрузкой).</w:t>
+        <w:t>2. Таблица генерации и энергобаланса: market_generation_mix (ENTSO-E Generation / Energy Mix)</w:t>
       </w:r>
     </w:p>
     <w:p>
-      <w:pPr>
-        <w:pStyle w:val="ListBullet2"/>
-        <w:spacing w:before="20" w:after="40"/>
-      </w:pPr>
       <w:r>
         <w:rPr>
-          <w:rFonts w:ascii="Consolas" w:hAnsi="Consolas"/>
-          <w:b/>
-          <w:color w:val="1B365D"/>
-          <w:sz w:val="18"/>
+          <w:i/>
         </w:rPr>
-        <w:t xml:space="preserve">task_logs &amp; recommendations: </w:t>
+        <w:t>Назначение: данные о производстве электроэнергии и структуре генерации по зонам. Партиционирование: RANGE по period_start (1 месяц).</w:t>
       </w:r>
+    </w:p>
+    <w:tbl>
+      <w:tblPr>
+        <w:tblStyle w:val="TableGrid"/>
+        <w:tblW w:type="auto" w:w="0"/>
+        <w:tblLook w:firstColumn="1" w:firstRow="1" w:lastColumn="0" w:lastRow="0" w:noHBand="0" w:noVBand="1" w:val="04A0"/>
+      </w:tblPr>
+      <w:tblGrid>
+        <w:gridCol w:w="3213"/>
+        <w:gridCol w:w="3213"/>
+        <w:gridCol w:w="3213"/>
+      </w:tblGrid>
+      <w:tr>
+        <w:tc>
+          <w:tcPr>
+            <w:tcW w:type="dxa" w:w="3213"/>
+          </w:tcPr>
+          <w:p>
+            <w:r>
+              <w:rPr>
+                <w:b/>
+              </w:rPr>
+              <w:t>Поле</w:t>
+            </w:r>
+          </w:p>
+        </w:tc>
+        <w:tc>
+          <w:tcPr>
+            <w:tcW w:type="dxa" w:w="3213"/>
+          </w:tcPr>
+          <w:p>
+            <w:r>
+              <w:rPr>
+                <w:b/>
+              </w:rPr>
+              <w:t>Бизнес-название</w:t>
+            </w:r>
+          </w:p>
+        </w:tc>
+        <w:tc>
+          <w:tcPr>
+            <w:tcW w:type="dxa" w:w="3213"/>
+          </w:tcPr>
+          <w:p>
+            <w:r>
+              <w:rPr>
+                <w:b/>
+              </w:rPr>
+              <w:t>Пояснение</w:t>
+            </w:r>
+          </w:p>
+        </w:tc>
+      </w:tr>
+      <w:tr>
+        <w:tc>
+          <w:tcPr>
+            <w:tcW w:type="dxa" w:w="3213"/>
+          </w:tcPr>
+          <w:p>
+            <w:r>
+              <w:t>bidding_zone</w:t>
+            </w:r>
+          </w:p>
+        </w:tc>
+        <w:tc>
+          <w:tcPr>
+            <w:tcW w:type="dxa" w:w="3213"/>
+          </w:tcPr>
+          <w:p>
+            <w:r>
+              <w:t>Энергозона</w:t>
+            </w:r>
+          </w:p>
+        </w:tc>
+        <w:tc>
+          <w:tcPr>
+            <w:tcW w:type="dxa" w:w="3213"/>
+          </w:tcPr>
+          <w:p>
+            <w:r>
+              <w:t>Энергозона, к которой относится генерация</w:t>
+            </w:r>
+          </w:p>
+        </w:tc>
+      </w:tr>
+      <w:tr>
+        <w:tc>
+          <w:tcPr>
+            <w:tcW w:type="dxa" w:w="3213"/>
+          </w:tcPr>
+          <w:p>
+            <w:r>
+              <w:t>period_start</w:t>
+            </w:r>
+          </w:p>
+        </w:tc>
+        <w:tc>
+          <w:tcPr>
+            <w:tcW w:type="dxa" w:w="3213"/>
+          </w:tcPr>
+          <w:p>
+            <w:r>
+              <w:t>Начало измерения</w:t>
+            </w:r>
+          </w:p>
+        </w:tc>
+        <w:tc>
+          <w:tcPr>
+            <w:tcW w:type="dxa" w:w="3213"/>
+          </w:tcPr>
+          <w:p>
+            <w:r>
+              <w:t>Начало интервала измерения</w:t>
+            </w:r>
+          </w:p>
+        </w:tc>
+      </w:tr>
+      <w:tr>
+        <w:tc>
+          <w:tcPr>
+            <w:tcW w:type="dxa" w:w="3213"/>
+          </w:tcPr>
+          <w:p>
+            <w:r>
+              <w:t>period_end</w:t>
+            </w:r>
+          </w:p>
+        </w:tc>
+        <w:tc>
+          <w:tcPr>
+            <w:tcW w:type="dxa" w:w="3213"/>
+          </w:tcPr>
+          <w:p>
+            <w:r>
+              <w:t>Конец измерения</w:t>
+            </w:r>
+          </w:p>
+        </w:tc>
+        <w:tc>
+          <w:tcPr>
+            <w:tcW w:type="dxa" w:w="3213"/>
+          </w:tcPr>
+          <w:p>
+            <w:r>
+              <w:t>Конец интервала</w:t>
+            </w:r>
+          </w:p>
+        </w:tc>
+      </w:tr>
+      <w:tr>
+        <w:tc>
+          <w:tcPr>
+            <w:tcW w:type="dxa" w:w="3213"/>
+          </w:tcPr>
+          <w:p>
+            <w:r>
+              <w:t>production_type</w:t>
+            </w:r>
+          </w:p>
+        </w:tc>
+        <w:tc>
+          <w:tcPr>
+            <w:tcW w:type="dxa" w:w="3213"/>
+          </w:tcPr>
+          <w:p>
+            <w:r>
+              <w:t>Тип энергии</w:t>
+            </w:r>
+          </w:p>
+        </w:tc>
+        <w:tc>
+          <w:tcPr>
+            <w:tcW w:type="dxa" w:w="3213"/>
+          </w:tcPr>
+          <w:p>
+            <w:r>
+              <w:t>Источник энергии: solar, wind, nuclear, gas и т. д.</w:t>
+            </w:r>
+          </w:p>
+        </w:tc>
+      </w:tr>
+      <w:tr>
+        <w:tc>
+          <w:tcPr>
+            <w:tcW w:type="dxa" w:w="3213"/>
+          </w:tcPr>
+          <w:p>
+            <w:r>
+              <w:t>generation_mw</w:t>
+            </w:r>
+          </w:p>
+        </w:tc>
+        <w:tc>
+          <w:tcPr>
+            <w:tcW w:type="dxa" w:w="3213"/>
+          </w:tcPr>
+          <w:p>
+            <w:r>
+              <w:t>Вырабатываемая мощность</w:t>
+            </w:r>
+          </w:p>
+        </w:tc>
+        <w:tc>
+          <w:tcPr>
+            <w:tcW w:type="dxa" w:w="3213"/>
+          </w:tcPr>
+          <w:p>
+            <w:r>
+              <w:t>Фактическая мощность генерации данного типа</w:t>
+            </w:r>
+          </w:p>
+        </w:tc>
+      </w:tr>
+      <w:tr>
+        <w:tc>
+          <w:tcPr>
+            <w:tcW w:type="dxa" w:w="3213"/>
+          </w:tcPr>
+          <w:p>
+            <w:r>
+              <w:t>resolution</w:t>
+            </w:r>
+          </w:p>
+        </w:tc>
+        <w:tc>
+          <w:tcPr>
+            <w:tcW w:type="dxa" w:w="3213"/>
+          </w:tcPr>
+          <w:p>
+            <w:r>
+              <w:t>Временной шаг данных</w:t>
+            </w:r>
+          </w:p>
+        </w:tc>
+        <w:tc>
+          <w:tcPr>
+            <w:tcW w:type="dxa" w:w="3213"/>
+          </w:tcPr>
+          <w:p>
+            <w:r>
+              <w:t>Временной шаг данных</w:t>
+            </w:r>
+          </w:p>
+        </w:tc>
+      </w:tr>
+    </w:tbl>
+    <w:p/>
+    <w:p>
       <w:r>
         <w:rPr>
-          <w:rFonts w:ascii="Arial" w:hAnsi="Arial"/>
-          <w:sz w:val="19"/>
+          <w:b/>
         </w:rPr>
-        <w:t>Журнал запросов оптимизации, выданных рекомендаций и фактической экономии.</w:t>
+        <w:t>3. Таблица прогноза погоды: weather_forecast (Open-Meteo Forecast API)</w:t>
       </w:r>
     </w:p>
+    <w:p>
+      <w:r>
+        <w:rPr>
+          <w:i/>
+        </w:rPr>
+        <w:t>Назначение: оперативный метеопрогноз около дата-центров (температура, влажность, скорость ветра, радиация). Партиционирование: RANGE по forecast_time (1 месяц).</w:t>
+      </w:r>
+    </w:p>
+    <w:tbl>
+      <w:tblPr>
+        <w:tblStyle w:val="TableGrid"/>
+        <w:tblW w:type="auto" w:w="0"/>
+        <w:tblLook w:firstColumn="1" w:firstRow="1" w:lastColumn="0" w:lastRow="0" w:noHBand="0" w:noVBand="1" w:val="04A0"/>
+      </w:tblPr>
+      <w:tblGrid>
+        <w:gridCol w:w="3213"/>
+        <w:gridCol w:w="3213"/>
+        <w:gridCol w:w="3213"/>
+      </w:tblGrid>
+      <w:tr>
+        <w:tc>
+          <w:tcPr>
+            <w:tcW w:type="dxa" w:w="3213"/>
+          </w:tcPr>
+          <w:p>
+            <w:r>
+              <w:rPr>
+                <w:b/>
+              </w:rPr>
+              <w:t>Поле</w:t>
+            </w:r>
+          </w:p>
+        </w:tc>
+        <w:tc>
+          <w:tcPr>
+            <w:tcW w:type="dxa" w:w="3213"/>
+          </w:tcPr>
+          <w:p>
+            <w:r>
+              <w:rPr>
+                <w:b/>
+              </w:rPr>
+              <w:t>Бизнес-название</w:t>
+            </w:r>
+          </w:p>
+        </w:tc>
+        <w:tc>
+          <w:tcPr>
+            <w:tcW w:type="dxa" w:w="3213"/>
+          </w:tcPr>
+          <w:p>
+            <w:r>
+              <w:rPr>
+                <w:b/>
+              </w:rPr>
+              <w:t>Пояснение</w:t>
+            </w:r>
+          </w:p>
+        </w:tc>
+      </w:tr>
+      <w:tr>
+        <w:tc>
+          <w:tcPr>
+            <w:tcW w:type="dxa" w:w="3213"/>
+          </w:tcPr>
+          <w:p>
+            <w:r>
+              <w:t>datacenter_id</w:t>
+            </w:r>
+          </w:p>
+        </w:tc>
+        <w:tc>
+          <w:tcPr>
+            <w:tcW w:type="dxa" w:w="3213"/>
+          </w:tcPr>
+          <w:p>
+            <w:r>
+              <w:t>ЦОД</w:t>
+            </w:r>
+          </w:p>
+        </w:tc>
+        <w:tc>
+          <w:tcPr>
+            <w:tcW w:type="dxa" w:w="3213"/>
+          </w:tcPr>
+          <w:p>
+            <w:r>
+              <w:t>Для какого ЦОД был получен прогноз</w:t>
+            </w:r>
+          </w:p>
+        </w:tc>
+      </w:tr>
+      <w:tr>
+        <w:tc>
+          <w:tcPr>
+            <w:tcW w:type="dxa" w:w="3213"/>
+          </w:tcPr>
+          <w:p>
+            <w:r>
+              <w:t>latitude</w:t>
+            </w:r>
+          </w:p>
+        </w:tc>
+        <w:tc>
+          <w:tcPr>
+            <w:tcW w:type="dxa" w:w="3213"/>
+          </w:tcPr>
+          <w:p>
+            <w:r>
+              <w:t>Широта</w:t>
+            </w:r>
+          </w:p>
+        </w:tc>
+        <w:tc>
+          <w:tcPr>
+            <w:tcW w:type="dxa" w:w="3213"/>
+          </w:tcPr>
+          <w:p>
+            <w:r>
+              <w:t>Широта</w:t>
+            </w:r>
+          </w:p>
+        </w:tc>
+      </w:tr>
+      <w:tr>
+        <w:tc>
+          <w:tcPr>
+            <w:tcW w:type="dxa" w:w="3213"/>
+          </w:tcPr>
+          <w:p>
+            <w:r>
+              <w:t>longitude</w:t>
+            </w:r>
+          </w:p>
+        </w:tc>
+        <w:tc>
+          <w:tcPr>
+            <w:tcW w:type="dxa" w:w="3213"/>
+          </w:tcPr>
+          <w:p>
+            <w:r>
+              <w:t>Долгота</w:t>
+            </w:r>
+          </w:p>
+        </w:tc>
+        <w:tc>
+          <w:tcPr>
+            <w:tcW w:type="dxa" w:w="3213"/>
+          </w:tcPr>
+          <w:p>
+            <w:r>
+              <w:t>Долгота</w:t>
+            </w:r>
+          </w:p>
+        </w:tc>
+      </w:tr>
+      <w:tr>
+        <w:tc>
+          <w:tcPr>
+            <w:tcW w:type="dxa" w:w="3213"/>
+          </w:tcPr>
+          <w:p>
+            <w:r>
+              <w:t>forecast_time</w:t>
+            </w:r>
+          </w:p>
+        </w:tc>
+        <w:tc>
+          <w:tcPr>
+            <w:tcW w:type="dxa" w:w="3213"/>
+          </w:tcPr>
+          <w:p>
+            <w:r>
+              <w:t>Время прогноза</w:t>
+            </w:r>
+          </w:p>
+        </w:tc>
+        <w:tc>
+          <w:tcPr>
+            <w:tcW w:type="dxa" w:w="3213"/>
+          </w:tcPr>
+          <w:p>
+            <w:r>
+              <w:t>На какой момент прогнозируется погода</w:t>
+            </w:r>
+          </w:p>
+        </w:tc>
+      </w:tr>
+      <w:tr>
+        <w:tc>
+          <w:tcPr>
+            <w:tcW w:type="dxa" w:w="3213"/>
+          </w:tcPr>
+          <w:p>
+            <w:r>
+              <w:t>temperature_2m</w:t>
+            </w:r>
+          </w:p>
+        </w:tc>
+        <w:tc>
+          <w:tcPr>
+            <w:tcW w:type="dxa" w:w="3213"/>
+          </w:tcPr>
+          <w:p>
+            <w:r>
+              <w:t>Температура воздуха</w:t>
+            </w:r>
+          </w:p>
+        </w:tc>
+        <w:tc>
+          <w:tcPr>
+            <w:tcW w:type="dxa" w:w="3213"/>
+          </w:tcPr>
+          <w:p>
+            <w:r>
+              <w:t>Температура воздуха; ключевой погодный фактор для охлаждения</w:t>
+            </w:r>
+          </w:p>
+        </w:tc>
+      </w:tr>
+      <w:tr>
+        <w:tc>
+          <w:tcPr>
+            <w:tcW w:type="dxa" w:w="3213"/>
+          </w:tcPr>
+          <w:p>
+            <w:r>
+              <w:t>relative_humidity_2m</w:t>
+            </w:r>
+          </w:p>
+        </w:tc>
+        <w:tc>
+          <w:tcPr>
+            <w:tcW w:type="dxa" w:w="3213"/>
+          </w:tcPr>
+          <w:p>
+            <w:r>
+              <w:t>Влажность</w:t>
+            </w:r>
+          </w:p>
+        </w:tc>
+        <w:tc>
+          <w:tcPr>
+            <w:tcW w:type="dxa" w:w="3213"/>
+          </w:tcPr>
+          <w:p>
+            <w:r>
+              <w:t>Влажность; может участвовать в модели эффективности охлаждения</w:t>
+            </w:r>
+          </w:p>
+        </w:tc>
+      </w:tr>
+      <w:tr>
+        <w:tc>
+          <w:tcPr>
+            <w:tcW w:type="dxa" w:w="3213"/>
+          </w:tcPr>
+          <w:p>
+            <w:r>
+              <w:t>cloud_cover</w:t>
+            </w:r>
+          </w:p>
+        </w:tc>
+        <w:tc>
+          <w:tcPr>
+            <w:tcW w:type="dxa" w:w="3213"/>
+          </w:tcPr>
+          <w:p>
+            <w:r>
+              <w:t>Облачность</w:t>
+            </w:r>
+          </w:p>
+        </w:tc>
+        <w:tc>
+          <w:tcPr>
+            <w:tcW w:type="dxa" w:w="3213"/>
+          </w:tcPr>
+          <w:p>
+            <w:r>
+              <w:t>Облачность, %</w:t>
+            </w:r>
+          </w:p>
+        </w:tc>
+      </w:tr>
+      <w:tr>
+        <w:tc>
+          <w:tcPr>
+            <w:tcW w:type="dxa" w:w="3213"/>
+          </w:tcPr>
+          <w:p>
+            <w:r>
+              <w:t>wind_speed_10m</w:t>
+            </w:r>
+          </w:p>
+        </w:tc>
+        <w:tc>
+          <w:tcPr>
+            <w:tcW w:type="dxa" w:w="3213"/>
+          </w:tcPr>
+          <w:p>
+            <w:r>
+              <w:t>Скорость ветра</w:t>
+            </w:r>
+          </w:p>
+        </w:tc>
+        <w:tc>
+          <w:tcPr>
+            <w:tcW w:type="dxa" w:w="3213"/>
+          </w:tcPr>
+          <w:p>
+            <w:r>
+              <w:t>Скорость ветра</w:t>
+            </w:r>
+          </w:p>
+        </w:tc>
+      </w:tr>
+      <w:tr>
+        <w:tc>
+          <w:tcPr>
+            <w:tcW w:type="dxa" w:w="3213"/>
+          </w:tcPr>
+          <w:p>
+            <w:r>
+              <w:t>shortwave_radiation</w:t>
+            </w:r>
+          </w:p>
+        </w:tc>
+        <w:tc>
+          <w:tcPr>
+            <w:tcW w:type="dxa" w:w="3213"/>
+          </w:tcPr>
+          <w:p>
+            <w:r>
+              <w:t>Солнечная радиация</w:t>
+            </w:r>
+          </w:p>
+        </w:tc>
+        <w:tc>
+          <w:tcPr>
+            <w:tcW w:type="dxa" w:w="3213"/>
+          </w:tcPr>
+          <w:p>
+            <w:r>
+              <w:t>Солнечная радиация</w:t>
+            </w:r>
+          </w:p>
+        </w:tc>
+      </w:tr>
+      <w:tr>
+        <w:tc>
+          <w:tcPr>
+            <w:tcW w:type="dxa" w:w="3213"/>
+          </w:tcPr>
+          <w:p>
+            <w:r>
+              <w:t>retrieved_at</w:t>
+            </w:r>
+          </w:p>
+        </w:tc>
+        <w:tc>
+          <w:tcPr>
+            <w:tcW w:type="dxa" w:w="3213"/>
+          </w:tcPr>
+          <w:p>
+            <w:r>
+              <w:t>Время получения</w:t>
+            </w:r>
+          </w:p>
+        </w:tc>
+        <w:tc>
+          <w:tcPr>
+            <w:tcW w:type="dxa" w:w="3213"/>
+          </w:tcPr>
+          <w:p>
+            <w:r>
+              <w:t>Когда именно мы получили этот прогноз</w:t>
+            </w:r>
+          </w:p>
+        </w:tc>
+      </w:tr>
+    </w:tbl>
+    <w:p/>
+    <w:p>
+      <w:r>
+        <w:rPr>
+          <w:b/>
+        </w:rPr>
+        <w:t>4. Таблица исторического метеоархива: weather_historical (Open-Meteo Historical Weather)</w:t>
+      </w:r>
+    </w:p>
+    <w:p>
+      <w:r>
+        <w:rPr>
+          <w:i/>
+        </w:rPr>
+        <w:t>Назначение: ретроспективные метеопараметры за 3–5 лет для EDA и обучения ML-моделей. Партиционирование: RANGE по observed_at (1 год).</w:t>
+      </w:r>
+    </w:p>
+    <w:tbl>
+      <w:tblPr>
+        <w:tblStyle w:val="TableGrid"/>
+        <w:tblW w:type="auto" w:w="0"/>
+        <w:tblLook w:firstColumn="1" w:firstRow="1" w:lastColumn="0" w:lastRow="0" w:noHBand="0" w:noVBand="1" w:val="04A0"/>
+      </w:tblPr>
+      <w:tblGrid>
+        <w:gridCol w:w="3213"/>
+        <w:gridCol w:w="3213"/>
+        <w:gridCol w:w="3213"/>
+      </w:tblGrid>
+      <w:tr>
+        <w:tc>
+          <w:tcPr>
+            <w:tcW w:type="dxa" w:w="3213"/>
+          </w:tcPr>
+          <w:p>
+            <w:r>
+              <w:rPr>
+                <w:b/>
+              </w:rPr>
+              <w:t>Поле</w:t>
+            </w:r>
+          </w:p>
+        </w:tc>
+        <w:tc>
+          <w:tcPr>
+            <w:tcW w:type="dxa" w:w="3213"/>
+          </w:tcPr>
+          <w:p>
+            <w:r>
+              <w:rPr>
+                <w:b/>
+              </w:rPr>
+              <w:t>Бизнес-название</w:t>
+            </w:r>
+          </w:p>
+        </w:tc>
+        <w:tc>
+          <w:tcPr>
+            <w:tcW w:type="dxa" w:w="3213"/>
+          </w:tcPr>
+          <w:p>
+            <w:r>
+              <w:rPr>
+                <w:b/>
+              </w:rPr>
+              <w:t>Пояснение</w:t>
+            </w:r>
+          </w:p>
+        </w:tc>
+      </w:tr>
+      <w:tr>
+        <w:tc>
+          <w:tcPr>
+            <w:tcW w:type="dxa" w:w="3213"/>
+          </w:tcPr>
+          <w:p>
+            <w:r>
+              <w:t>datacenter_id</w:t>
+            </w:r>
+          </w:p>
+        </w:tc>
+        <w:tc>
+          <w:tcPr>
+            <w:tcW w:type="dxa" w:w="3213"/>
+          </w:tcPr>
+          <w:p>
+            <w:r>
+              <w:t>ЦОД</w:t>
+            </w:r>
+          </w:p>
+        </w:tc>
+        <w:tc>
+          <w:tcPr>
+            <w:tcW w:type="dxa" w:w="3213"/>
+          </w:tcPr>
+          <w:p>
+            <w:r>
+              <w:t>Привязка погоды к ЦОД</w:t>
+            </w:r>
+          </w:p>
+        </w:tc>
+      </w:tr>
+      <w:tr>
+        <w:tc>
+          <w:tcPr>
+            <w:tcW w:type="dxa" w:w="3213"/>
+          </w:tcPr>
+          <w:p>
+            <w:r>
+              <w:t>latitude</w:t>
+            </w:r>
+          </w:p>
+        </w:tc>
+        <w:tc>
+          <w:tcPr>
+            <w:tcW w:type="dxa" w:w="3213"/>
+          </w:tcPr>
+          <w:p>
+            <w:r>
+              <w:t>Широта</w:t>
+            </w:r>
+          </w:p>
+        </w:tc>
+        <w:tc>
+          <w:tcPr>
+            <w:tcW w:type="dxa" w:w="3213"/>
+          </w:tcPr>
+          <w:p>
+            <w:r>
+              <w:t>Широта</w:t>
+            </w:r>
+          </w:p>
+        </w:tc>
+      </w:tr>
+      <w:tr>
+        <w:tc>
+          <w:tcPr>
+            <w:tcW w:type="dxa" w:w="3213"/>
+          </w:tcPr>
+          <w:p>
+            <w:r>
+              <w:t>longitude</w:t>
+            </w:r>
+          </w:p>
+        </w:tc>
+        <w:tc>
+          <w:tcPr>
+            <w:tcW w:type="dxa" w:w="3213"/>
+          </w:tcPr>
+          <w:p>
+            <w:r>
+              <w:t>Долгота</w:t>
+            </w:r>
+          </w:p>
+        </w:tc>
+        <w:tc>
+          <w:tcPr>
+            <w:tcW w:type="dxa" w:w="3213"/>
+          </w:tcPr>
+          <w:p>
+            <w:r>
+              <w:t>Долгота</w:t>
+            </w:r>
+          </w:p>
+        </w:tc>
+      </w:tr>
+      <w:tr>
+        <w:tc>
+          <w:tcPr>
+            <w:tcW w:type="dxa" w:w="3213"/>
+          </w:tcPr>
+          <w:p>
+            <w:r>
+              <w:t>observed_at</w:t>
+            </w:r>
+          </w:p>
+        </w:tc>
+        <w:tc>
+          <w:tcPr>
+            <w:tcW w:type="dxa" w:w="3213"/>
+          </w:tcPr>
+          <w:p>
+            <w:r>
+              <w:t>Время замера</w:t>
+            </w:r>
+          </w:p>
+        </w:tc>
+        <w:tc>
+          <w:tcPr>
+            <w:tcW w:type="dxa" w:w="3213"/>
+          </w:tcPr>
+          <w:p>
+            <w:r>
+              <w:t>Время исторического значения</w:t>
+            </w:r>
+          </w:p>
+        </w:tc>
+      </w:tr>
+      <w:tr>
+        <w:tc>
+          <w:tcPr>
+            <w:tcW w:type="dxa" w:w="3213"/>
+          </w:tcPr>
+          <w:p>
+            <w:r>
+              <w:t>temperature_2m</w:t>
+            </w:r>
+          </w:p>
+        </w:tc>
+        <w:tc>
+          <w:tcPr>
+            <w:tcW w:type="dxa" w:w="3213"/>
+          </w:tcPr>
+          <w:p>
+            <w:r>
+              <w:t>Температура</w:t>
+            </w:r>
+          </w:p>
+        </w:tc>
+        <w:tc>
+          <w:tcPr>
+            <w:tcW w:type="dxa" w:w="3213"/>
+          </w:tcPr>
+          <w:p>
+            <w:r>
+              <w:t>Историческая температура</w:t>
+            </w:r>
+          </w:p>
+        </w:tc>
+      </w:tr>
+      <w:tr>
+        <w:tc>
+          <w:tcPr>
+            <w:tcW w:type="dxa" w:w="3213"/>
+          </w:tcPr>
+          <w:p>
+            <w:r>
+              <w:t>relative_humidity_2m</w:t>
+            </w:r>
+          </w:p>
+        </w:tc>
+        <w:tc>
+          <w:tcPr>
+            <w:tcW w:type="dxa" w:w="3213"/>
+          </w:tcPr>
+          <w:p>
+            <w:r>
+              <w:t>Влажность</w:t>
+            </w:r>
+          </w:p>
+        </w:tc>
+        <w:tc>
+          <w:tcPr>
+            <w:tcW w:type="dxa" w:w="3213"/>
+          </w:tcPr>
+          <w:p>
+            <w:r>
+              <w:t>Историческая влажность</w:t>
+            </w:r>
+          </w:p>
+        </w:tc>
+      </w:tr>
+      <w:tr>
+        <w:tc>
+          <w:tcPr>
+            <w:tcW w:type="dxa" w:w="3213"/>
+          </w:tcPr>
+          <w:p>
+            <w:r>
+              <w:t>cloud_cover</w:t>
+            </w:r>
+          </w:p>
+        </w:tc>
+        <w:tc>
+          <w:tcPr>
+            <w:tcW w:type="dxa" w:w="3213"/>
+          </w:tcPr>
+          <w:p>
+            <w:r>
+              <w:t>Облачность</w:t>
+            </w:r>
+          </w:p>
+        </w:tc>
+        <w:tc>
+          <w:tcPr>
+            <w:tcW w:type="dxa" w:w="3213"/>
+          </w:tcPr>
+          <w:p>
+            <w:r>
+              <w:t>Историческая облачность</w:t>
+            </w:r>
+          </w:p>
+        </w:tc>
+      </w:tr>
+      <w:tr>
+        <w:tc>
+          <w:tcPr>
+            <w:tcW w:type="dxa" w:w="3213"/>
+          </w:tcPr>
+          <w:p>
+            <w:r>
+              <w:t>wind_speed_10m</w:t>
+            </w:r>
+          </w:p>
+        </w:tc>
+        <w:tc>
+          <w:tcPr>
+            <w:tcW w:type="dxa" w:w="3213"/>
+          </w:tcPr>
+          <w:p>
+            <w:r>
+              <w:t>Скорость ветра</w:t>
+            </w:r>
+          </w:p>
+        </w:tc>
+        <w:tc>
+          <w:tcPr>
+            <w:tcW w:type="dxa" w:w="3213"/>
+          </w:tcPr>
+          <w:p>
+            <w:r>
+              <w:t>Историческая скорость ветра</w:t>
+            </w:r>
+          </w:p>
+        </w:tc>
+      </w:tr>
+      <w:tr>
+        <w:tc>
+          <w:tcPr>
+            <w:tcW w:type="dxa" w:w="3213"/>
+          </w:tcPr>
+          <w:p>
+            <w:r>
+              <w:t>shortwave_radiation</w:t>
+            </w:r>
+          </w:p>
+        </w:tc>
+        <w:tc>
+          <w:tcPr>
+            <w:tcW w:type="dxa" w:w="3213"/>
+          </w:tcPr>
+          <w:p>
+            <w:r>
+              <w:t>Солнечная радиация</w:t>
+            </w:r>
+          </w:p>
+        </w:tc>
+        <w:tc>
+          <w:tcPr>
+            <w:tcW w:type="dxa" w:w="3213"/>
+          </w:tcPr>
+          <w:p>
+            <w:r>
+              <w:t>Историческая солнечная радиация</w:t>
+            </w:r>
+          </w:p>
+        </w:tc>
+      </w:tr>
+    </w:tbl>
+    <w:p/>
+    <w:p>
+      <w:r>
+        <w:rPr>
+          <w:b/>
+        </w:rPr>
+        <w:t>5. Справочник инфраструктуры клиента: client_infrastructure</w:t>
+      </w:r>
+    </w:p>
+    <w:p>
+      <w:r>
+        <w:rPr>
+          <w:i/>
+        </w:rPr>
+        <w:t>Назначение: справочник площадок ЦОД, географических координат, базового PUE и характеристик серверного парка.</w:t>
+      </w:r>
+    </w:p>
+    <w:tbl>
+      <w:tblPr>
+        <w:tblStyle w:val="TableGrid"/>
+        <w:tblW w:type="auto" w:w="0"/>
+        <w:tblLook w:firstColumn="1" w:firstRow="1" w:lastColumn="0" w:lastRow="0" w:noHBand="0" w:noVBand="1" w:val="04A0"/>
+      </w:tblPr>
+      <w:tblGrid>
+        <w:gridCol w:w="3213"/>
+        <w:gridCol w:w="3213"/>
+        <w:gridCol w:w="3213"/>
+      </w:tblGrid>
+      <w:tr>
+        <w:tc>
+          <w:tcPr>
+            <w:tcW w:type="dxa" w:w="3213"/>
+          </w:tcPr>
+          <w:p>
+            <w:r>
+              <w:rPr>
+                <w:b/>
+              </w:rPr>
+              <w:t>Поле</w:t>
+            </w:r>
+          </w:p>
+        </w:tc>
+        <w:tc>
+          <w:tcPr>
+            <w:tcW w:type="dxa" w:w="3213"/>
+          </w:tcPr>
+          <w:p>
+            <w:r>
+              <w:rPr>
+                <w:b/>
+              </w:rPr>
+              <w:t>Бизнес-название</w:t>
+            </w:r>
+          </w:p>
+        </w:tc>
+        <w:tc>
+          <w:tcPr>
+            <w:tcW w:type="dxa" w:w="3213"/>
+          </w:tcPr>
+          <w:p>
+            <w:r>
+              <w:rPr>
+                <w:b/>
+              </w:rPr>
+              <w:t>Пояснение</w:t>
+            </w:r>
+          </w:p>
+        </w:tc>
+      </w:tr>
+      <w:tr>
+        <w:tc>
+          <w:tcPr>
+            <w:tcW w:type="dxa" w:w="3213"/>
+          </w:tcPr>
+          <w:p>
+            <w:r>
+              <w:t>datacenter_id</w:t>
+            </w:r>
+          </w:p>
+        </w:tc>
+        <w:tc>
+          <w:tcPr>
+            <w:tcW w:type="dxa" w:w="3213"/>
+          </w:tcPr>
+          <w:p>
+            <w:r>
+              <w:t>ЦОД</w:t>
+            </w:r>
+          </w:p>
+        </w:tc>
+        <w:tc>
+          <w:tcPr>
+            <w:tcW w:type="dxa" w:w="3213"/>
+          </w:tcPr>
+          <w:p>
+            <w:r>
+              <w:t>Уникальный ID вычислительной площадки</w:t>
+            </w:r>
+          </w:p>
+        </w:tc>
+      </w:tr>
+      <w:tr>
+        <w:tc>
+          <w:tcPr>
+            <w:tcW w:type="dxa" w:w="3213"/>
+          </w:tcPr>
+          <w:p>
+            <w:r>
+              <w:t>name</w:t>
+            </w:r>
+          </w:p>
+        </w:tc>
+        <w:tc>
+          <w:tcPr>
+            <w:tcW w:type="dxa" w:w="3213"/>
+          </w:tcPr>
+          <w:p>
+            <w:r>
+              <w:t>Имя ЦОД</w:t>
+            </w:r>
+          </w:p>
+        </w:tc>
+        <w:tc>
+          <w:tcPr>
+            <w:tcW w:type="dxa" w:w="3213"/>
+          </w:tcPr>
+          <w:p>
+            <w:r>
+              <w:t>Название ЦОД</w:t>
+            </w:r>
+          </w:p>
+        </w:tc>
+      </w:tr>
+      <w:tr>
+        <w:tc>
+          <w:tcPr>
+            <w:tcW w:type="dxa" w:w="3213"/>
+          </w:tcPr>
+          <w:p>
+            <w:r>
+              <w:t>bidding_zone</w:t>
+            </w:r>
+          </w:p>
+        </w:tc>
+        <w:tc>
+          <w:tcPr>
+            <w:tcW w:type="dxa" w:w="3213"/>
+          </w:tcPr>
+          <w:p>
+            <w:r>
+              <w:t>Цена зоны</w:t>
+            </w:r>
+          </w:p>
+        </w:tc>
+        <w:tc>
+          <w:tcPr>
+            <w:tcW w:type="dxa" w:w="3213"/>
+          </w:tcPr>
+          <w:p>
+            <w:r>
+              <w:t>Связывает ЦОД с ценами ENTSO-E</w:t>
+            </w:r>
+          </w:p>
+        </w:tc>
+      </w:tr>
+      <w:tr>
+        <w:tc>
+          <w:tcPr>
+            <w:tcW w:type="dxa" w:w="3213"/>
+          </w:tcPr>
+          <w:p>
+            <w:r>
+              <w:t>latitude</w:t>
+            </w:r>
+          </w:p>
+        </w:tc>
+        <w:tc>
+          <w:tcPr>
+            <w:tcW w:type="dxa" w:w="3213"/>
+          </w:tcPr>
+          <w:p>
+            <w:r>
+              <w:t>Широта</w:t>
+            </w:r>
+          </w:p>
+        </w:tc>
+        <w:tc>
+          <w:tcPr>
+            <w:tcW w:type="dxa" w:w="3213"/>
+          </w:tcPr>
+          <w:p>
+            <w:r>
+              <w:t>Широта</w:t>
+            </w:r>
+          </w:p>
+        </w:tc>
+      </w:tr>
+      <w:tr>
+        <w:tc>
+          <w:tcPr>
+            <w:tcW w:type="dxa" w:w="3213"/>
+          </w:tcPr>
+          <w:p>
+            <w:r>
+              <w:t>longitude</w:t>
+            </w:r>
+          </w:p>
+        </w:tc>
+        <w:tc>
+          <w:tcPr>
+            <w:tcW w:type="dxa" w:w="3213"/>
+          </w:tcPr>
+          <w:p>
+            <w:r>
+              <w:t>Долгота</w:t>
+            </w:r>
+          </w:p>
+        </w:tc>
+        <w:tc>
+          <w:tcPr>
+            <w:tcW w:type="dxa" w:w="3213"/>
+          </w:tcPr>
+          <w:p>
+            <w:r>
+              <w:t>Долгота</w:t>
+            </w:r>
+          </w:p>
+        </w:tc>
+      </w:tr>
+      <w:tr>
+        <w:tc>
+          <w:tcPr>
+            <w:tcW w:type="dxa" w:w="3213"/>
+          </w:tcPr>
+          <w:p>
+            <w:r>
+              <w:t>max_power_kw</w:t>
+            </w:r>
+          </w:p>
+        </w:tc>
+        <w:tc>
+          <w:tcPr>
+            <w:tcW w:type="dxa" w:w="3213"/>
+          </w:tcPr>
+          <w:p>
+            <w:r>
+              <w:t>Предел выч. мощности</w:t>
+            </w:r>
+          </w:p>
+        </w:tc>
+        <w:tc>
+          <w:tcPr>
+            <w:tcW w:type="dxa" w:w="3213"/>
+          </w:tcPr>
+          <w:p>
+            <w:r>
+              <w:t>Максимальная доступная вычислительная/энергетическая мощность</w:t>
+            </w:r>
+          </w:p>
+        </w:tc>
+      </w:tr>
+      <w:tr>
+        <w:tc>
+          <w:tcPr>
+            <w:tcW w:type="dxa" w:w="3213"/>
+          </w:tcPr>
+          <w:p>
+            <w:r>
+              <w:t>base_pue</w:t>
+            </w:r>
+          </w:p>
+        </w:tc>
+        <w:tc>
+          <w:tcPr>
+            <w:tcW w:type="dxa" w:w="3213"/>
+          </w:tcPr>
+          <w:p>
+            <w:r>
+              <w:t>Эффективность энерготрат</w:t>
+            </w:r>
+          </w:p>
+        </w:tc>
+        <w:tc>
+          <w:tcPr>
+            <w:tcW w:type="dxa" w:w="3213"/>
+          </w:tcPr>
+          <w:p>
+            <w:r>
+              <w:t>Базовый Power Usage Effectiveness ЦОД</w:t>
+            </w:r>
+          </w:p>
+        </w:tc>
+      </w:tr>
+      <w:tr>
+        <w:tc>
+          <w:tcPr>
+            <w:tcW w:type="dxa" w:w="3213"/>
+          </w:tcPr>
+          <w:p>
+            <w:r>
+              <w:t>is_active</w:t>
+            </w:r>
+          </w:p>
+        </w:tc>
+        <w:tc>
+          <w:tcPr>
+            <w:tcW w:type="dxa" w:w="3213"/>
+          </w:tcPr>
+          <w:p>
+            <w:r>
+              <w:t>Доступность</w:t>
+            </w:r>
+          </w:p>
+        </w:tc>
+        <w:tc>
+          <w:tcPr>
+            <w:tcW w:type="dxa" w:w="3213"/>
+          </w:tcPr>
+          <w:p>
+            <w:r>
+              <w:t>Можно ли сейчас использовать площадку</w:t>
+            </w:r>
+          </w:p>
+        </w:tc>
+      </w:tr>
+      <w:tr>
+        <w:tc>
+          <w:tcPr>
+            <w:tcW w:type="dxa" w:w="3213"/>
+          </w:tcPr>
+          <w:p>
+            <w:r>
+              <w:t>created_at</w:t>
+            </w:r>
+          </w:p>
+        </w:tc>
+        <w:tc>
+          <w:tcPr>
+            <w:tcW w:type="dxa" w:w="3213"/>
+          </w:tcPr>
+          <w:p>
+            <w:r>
+              <w:t>Регистрация ЦОД</w:t>
+            </w:r>
+          </w:p>
+        </w:tc>
+        <w:tc>
+          <w:tcPr>
+            <w:tcW w:type="dxa" w:w="3213"/>
+          </w:tcPr>
+          <w:p>
+            <w:r>
+              <w:t>Когда ЦОД зарегистрирован в системе</w:t>
+            </w:r>
+          </w:p>
+        </w:tc>
+      </w:tr>
+    </w:tbl>
+    <w:p/>
+    <w:p>
+      <w:r>
+        <w:rPr>
+          <w:b/>
+        </w:rPr>
+        <w:t>6. Журнал параметров вычислительных задач: task_parameters (Параметры вычислительной задачи)</w:t>
+      </w:r>
+    </w:p>
+    <w:p>
+      <w:r>
+        <w:rPr>
+          <w:i/>
+        </w:rPr>
+        <w:t>Назначение: входящие требования к вычислительным задачам от внутренних систем/планировщиков клиента.</w:t>
+      </w:r>
+    </w:p>
+    <w:tbl>
+      <w:tblPr>
+        <w:tblStyle w:val="TableGrid"/>
+        <w:tblW w:type="auto" w:w="0"/>
+        <w:tblLook w:firstColumn="1" w:firstRow="1" w:lastColumn="0" w:lastRow="0" w:noHBand="0" w:noVBand="1" w:val="04A0"/>
+      </w:tblPr>
+      <w:tblGrid>
+        <w:gridCol w:w="3213"/>
+        <w:gridCol w:w="3213"/>
+        <w:gridCol w:w="3213"/>
+      </w:tblGrid>
+      <w:tr>
+        <w:tc>
+          <w:tcPr>
+            <w:tcW w:type="dxa" w:w="3213"/>
+          </w:tcPr>
+          <w:p>
+            <w:r>
+              <w:rPr>
+                <w:b/>
+              </w:rPr>
+              <w:t>Поле</w:t>
+            </w:r>
+          </w:p>
+        </w:tc>
+        <w:tc>
+          <w:tcPr>
+            <w:tcW w:type="dxa" w:w="3213"/>
+          </w:tcPr>
+          <w:p>
+            <w:r>
+              <w:rPr>
+                <w:b/>
+              </w:rPr>
+              <w:t>Бизнес-название</w:t>
+            </w:r>
+          </w:p>
+        </w:tc>
+        <w:tc>
+          <w:tcPr>
+            <w:tcW w:type="dxa" w:w="3213"/>
+          </w:tcPr>
+          <w:p>
+            <w:r>
+              <w:rPr>
+                <w:b/>
+              </w:rPr>
+              <w:t>Пояснение</w:t>
+            </w:r>
+          </w:p>
+        </w:tc>
+      </w:tr>
+      <w:tr>
+        <w:tc>
+          <w:tcPr>
+            <w:tcW w:type="dxa" w:w="3213"/>
+          </w:tcPr>
+          <w:p>
+            <w:r>
+              <w:t>job_id</w:t>
+            </w:r>
+          </w:p>
+        </w:tc>
+        <w:tc>
+          <w:tcPr>
+            <w:tcW w:type="dxa" w:w="3213"/>
+          </w:tcPr>
+          <w:p>
+            <w:r>
+              <w:t>Задача</w:t>
+            </w:r>
+          </w:p>
+        </w:tc>
+        <w:tc>
+          <w:tcPr>
+            <w:tcW w:type="dxa" w:w="3213"/>
+          </w:tcPr>
+          <w:p>
+            <w:r>
+              <w:t>Уникальный идентификатор задачи</w:t>
+            </w:r>
+          </w:p>
+        </w:tc>
+      </w:tr>
+      <w:tr>
+        <w:tc>
+          <w:tcPr>
+            <w:tcW w:type="dxa" w:w="3213"/>
+          </w:tcPr>
+          <w:p>
+            <w:r>
+              <w:t>name</w:t>
+            </w:r>
+          </w:p>
+        </w:tc>
+        <w:tc>
+          <w:tcPr>
+            <w:tcW w:type="dxa" w:w="3213"/>
+          </w:tcPr>
+          <w:p>
+            <w:r>
+              <w:t>Имя задачи</w:t>
+            </w:r>
+          </w:p>
+        </w:tc>
+        <w:tc>
+          <w:tcPr>
+            <w:tcW w:type="dxa" w:w="3213"/>
+          </w:tcPr>
+          <w:p>
+            <w:r>
+              <w:t>Название задачи</w:t>
+            </w:r>
+          </w:p>
+        </w:tc>
+      </w:tr>
+      <w:tr>
+        <w:tc>
+          <w:tcPr>
+            <w:tcW w:type="dxa" w:w="3213"/>
+          </w:tcPr>
+          <w:p>
+            <w:r>
+              <w:t>duration_minutes</w:t>
+            </w:r>
+          </w:p>
+        </w:tc>
+        <w:tc>
+          <w:tcPr>
+            <w:tcW w:type="dxa" w:w="3213"/>
+          </w:tcPr>
+          <w:p>
+            <w:r>
+              <w:t>Время выполнения</w:t>
+            </w:r>
+          </w:p>
+        </w:tc>
+        <w:tc>
+          <w:tcPr>
+            <w:tcW w:type="dxa" w:w="3213"/>
+          </w:tcPr>
+          <w:p>
+            <w:r>
+              <w:t>Сколько непрерывно должна выполняться задача</w:t>
+            </w:r>
+          </w:p>
+        </w:tc>
+      </w:tr>
+      <w:tr>
+        <w:tc>
+          <w:tcPr>
+            <w:tcW w:type="dxa" w:w="3213"/>
+          </w:tcPr>
+          <w:p>
+            <w:r>
+              <w:t>required_power_kw</w:t>
+            </w:r>
+          </w:p>
+        </w:tc>
+        <w:tc>
+          <w:tcPr>
+            <w:tcW w:type="dxa" w:w="3213"/>
+          </w:tcPr>
+          <w:p>
+            <w:r>
+              <w:t>Затраты мощности</w:t>
+            </w:r>
+          </w:p>
+        </w:tc>
+        <w:tc>
+          <w:tcPr>
+            <w:tcW w:type="dxa" w:w="3213"/>
+          </w:tcPr>
+          <w:p>
+            <w:r>
+              <w:t>Оценочная мощность вычислений</w:t>
+            </w:r>
+          </w:p>
+        </w:tc>
+      </w:tr>
+      <w:tr>
+        <w:tc>
+          <w:tcPr>
+            <w:tcW w:type="dxa" w:w="3213"/>
+          </w:tcPr>
+          <w:p>
+            <w:r>
+              <w:t>earliest_start</w:t>
+            </w:r>
+          </w:p>
+        </w:tc>
+        <w:tc>
+          <w:tcPr>
+            <w:tcW w:type="dxa" w:w="3213"/>
+          </w:tcPr>
+          <w:p>
+            <w:r>
+              <w:t>Приемлемый старт</w:t>
+            </w:r>
+          </w:p>
+        </w:tc>
+        <w:tc>
+          <w:tcPr>
+            <w:tcW w:type="dxa" w:w="3213"/>
+          </w:tcPr>
+          <w:p>
+            <w:r>
+              <w:t>Раньше какого момента запускать нельзя</w:t>
+            </w:r>
+          </w:p>
+        </w:tc>
+      </w:tr>
+      <w:tr>
+        <w:tc>
+          <w:tcPr>
+            <w:tcW w:type="dxa" w:w="3213"/>
+          </w:tcPr>
+          <w:p>
+            <w:r>
+              <w:t>deadline</w:t>
+            </w:r>
+          </w:p>
+        </w:tc>
+        <w:tc>
+          <w:tcPr>
+            <w:tcW w:type="dxa" w:w="3213"/>
+          </w:tcPr>
+          <w:p>
+            <w:r>
+              <w:t>Дедлайн</w:t>
+            </w:r>
+          </w:p>
+        </w:tc>
+        <w:tc>
+          <w:tcPr>
+            <w:tcW w:type="dxa" w:w="3213"/>
+          </w:tcPr>
+          <w:p>
+            <w:r>
+              <w:t>К какому моменту задача должна завершиться</w:t>
+            </w:r>
+          </w:p>
+        </w:tc>
+      </w:tr>
+      <w:tr>
+        <w:tc>
+          <w:tcPr>
+            <w:tcW w:type="dxa" w:w="3213"/>
+          </w:tcPr>
+          <w:p>
+            <w:r>
+              <w:t>preferred_datacenter_id</w:t>
+            </w:r>
+          </w:p>
+        </w:tc>
+        <w:tc>
+          <w:tcPr>
+            <w:tcW w:type="dxa" w:w="3213"/>
+          </w:tcPr>
+          <w:p>
+            <w:r>
+              <w:t>Предпочтительный ЦОД</w:t>
+            </w:r>
+          </w:p>
+        </w:tc>
+        <w:tc>
+          <w:tcPr>
+            <w:tcW w:type="dxa" w:w="3213"/>
+          </w:tcPr>
+          <w:p>
+            <w:r>
+              <w:t>Текущая/предпочтительная площадка, если есть</w:t>
+            </w:r>
+          </w:p>
+        </w:tc>
+      </w:tr>
+      <w:tr>
+        <w:tc>
+          <w:tcPr>
+            <w:tcW w:type="dxa" w:w="3213"/>
+          </w:tcPr>
+          <w:p>
+            <w:r>
+              <w:t>allow_geo_migration</w:t>
+            </w:r>
+          </w:p>
+        </w:tc>
+        <w:tc>
+          <w:tcPr>
+            <w:tcW w:type="dxa" w:w="3213"/>
+          </w:tcPr>
+          <w:p>
+            <w:r>
+              <w:t>Статус переноса задачи</w:t>
+            </w:r>
+          </w:p>
+        </w:tc>
+        <w:tc>
+          <w:tcPr>
+            <w:tcW w:type="dxa" w:w="3213"/>
+          </w:tcPr>
+          <w:p>
+            <w:r>
+              <w:t>Разрешено ли переносить вычисление в другую энергозону</w:t>
+            </w:r>
+          </w:p>
+        </w:tc>
+      </w:tr>
+      <w:tr>
+        <w:tc>
+          <w:tcPr>
+            <w:tcW w:type="dxa" w:w="3213"/>
+          </w:tcPr>
+          <w:p>
+            <w:r>
+              <w:t>created_at</w:t>
+            </w:r>
+          </w:p>
+        </w:tc>
+        <w:tc>
+          <w:tcPr>
+            <w:tcW w:type="dxa" w:w="3213"/>
+          </w:tcPr>
+          <w:p>
+            <w:r>
+              <w:t>Поступление задачи</w:t>
+            </w:r>
+          </w:p>
+        </w:tc>
+        <w:tc>
+          <w:tcPr>
+            <w:tcW w:type="dxa" w:w="3213"/>
+          </w:tcPr>
+          <w:p>
+            <w:r>
+              <w:t>Когда задача поступила</w:t>
+            </w:r>
+          </w:p>
+        </w:tc>
+      </w:tr>
+    </w:tbl>
+    <w:p/>
+    <w:p>
+      <w:r>
+        <w:rPr>
+          <w:b/>
+        </w:rPr>
+        <w:t>7. Журнал рекомендаций и результатов расчётов: task_history (Внутренние журналы задач и результаты рекомендаций)</w:t>
+      </w:r>
+    </w:p>
+    <w:p>
+      <w:r>
+        <w:rPr>
+          <w:i/>
+        </w:rPr>
+        <w:t>Назначение: история запросов, выбранное окно запуска, выбранный ЦОД, расчётная стоимость, базовая стоимость и экономия. Партиционирование: RANGE по calculated_at (1 месяц).</w:t>
+      </w:r>
+    </w:p>
+    <w:tbl>
+      <w:tblPr>
+        <w:tblStyle w:val="TableGrid"/>
+        <w:tblW w:type="auto" w:w="0"/>
+        <w:tblLook w:firstColumn="1" w:firstRow="1" w:lastColumn="0" w:lastRow="0" w:noHBand="0" w:noVBand="1" w:val="04A0"/>
+      </w:tblPr>
+      <w:tblGrid>
+        <w:gridCol w:w="3213"/>
+        <w:gridCol w:w="3213"/>
+        <w:gridCol w:w="3213"/>
+      </w:tblGrid>
+      <w:tr>
+        <w:tc>
+          <w:tcPr>
+            <w:tcW w:type="dxa" w:w="3213"/>
+          </w:tcPr>
+          <w:p>
+            <w:r>
+              <w:rPr>
+                <w:b/>
+              </w:rPr>
+              <w:t>Поле</w:t>
+            </w:r>
+          </w:p>
+        </w:tc>
+        <w:tc>
+          <w:tcPr>
+            <w:tcW w:type="dxa" w:w="3213"/>
+          </w:tcPr>
+          <w:p>
+            <w:r>
+              <w:rPr>
+                <w:b/>
+              </w:rPr>
+              <w:t>Бизнес-название</w:t>
+            </w:r>
+          </w:p>
+        </w:tc>
+        <w:tc>
+          <w:tcPr>
+            <w:tcW w:type="dxa" w:w="3213"/>
+          </w:tcPr>
+          <w:p>
+            <w:r>
+              <w:rPr>
+                <w:b/>
+              </w:rPr>
+              <w:t>Пояснение</w:t>
+            </w:r>
+          </w:p>
+        </w:tc>
+      </w:tr>
+      <w:tr>
+        <w:tc>
+          <w:tcPr>
+            <w:tcW w:type="dxa" w:w="3213"/>
+          </w:tcPr>
+          <w:p>
+            <w:r>
+              <w:t>recommendation_id</w:t>
+            </w:r>
+          </w:p>
+        </w:tc>
+        <w:tc>
+          <w:tcPr>
+            <w:tcW w:type="dxa" w:w="3213"/>
+          </w:tcPr>
+          <w:p>
+            <w:r>
+              <w:t>Рекомендация</w:t>
+            </w:r>
+          </w:p>
+        </w:tc>
+        <w:tc>
+          <w:tcPr>
+            <w:tcW w:type="dxa" w:w="3213"/>
+          </w:tcPr>
+          <w:p>
+            <w:r>
+              <w:t>ID рекомендации</w:t>
+            </w:r>
+          </w:p>
+        </w:tc>
+      </w:tr>
+      <w:tr>
+        <w:tc>
+          <w:tcPr>
+            <w:tcW w:type="dxa" w:w="3213"/>
+          </w:tcPr>
+          <w:p>
+            <w:r>
+              <w:t>job_id</w:t>
+            </w:r>
+          </w:p>
+        </w:tc>
+        <w:tc>
+          <w:tcPr>
+            <w:tcW w:type="dxa" w:w="3213"/>
+          </w:tcPr>
+          <w:p>
+            <w:r>
+              <w:t>Задача</w:t>
+            </w:r>
+          </w:p>
+        </w:tc>
+        <w:tc>
+          <w:tcPr>
+            <w:tcW w:type="dxa" w:w="3213"/>
+          </w:tcPr>
+          <w:p>
+            <w:r>
+              <w:t>Для какой задачи произведён расчёт</w:t>
+            </w:r>
+          </w:p>
+        </w:tc>
+      </w:tr>
+      <w:tr>
+        <w:tc>
+          <w:tcPr>
+            <w:tcW w:type="dxa" w:w="3213"/>
+          </w:tcPr>
+          <w:p>
+            <w:r>
+              <w:t>datacenter_id</w:t>
+            </w:r>
+          </w:p>
+        </w:tc>
+        <w:tc>
+          <w:tcPr>
+            <w:tcW w:type="dxa" w:w="3213"/>
+          </w:tcPr>
+          <w:p>
+            <w:r>
+              <w:t>Центр обработки данных</w:t>
+            </w:r>
+          </w:p>
+        </w:tc>
+        <w:tc>
+          <w:tcPr>
+            <w:tcW w:type="dxa" w:w="3213"/>
+          </w:tcPr>
+          <w:p>
+            <w:r>
+              <w:t>Какой ЦОД выбран</w:t>
+            </w:r>
+          </w:p>
+        </w:tc>
+      </w:tr>
+      <w:tr>
+        <w:tc>
+          <w:tcPr>
+            <w:tcW w:type="dxa" w:w="3213"/>
+          </w:tcPr>
+          <w:p>
+            <w:r>
+              <w:t>recommended_start</w:t>
+            </w:r>
+          </w:p>
+        </w:tc>
+        <w:tc>
+          <w:tcPr>
+            <w:tcW w:type="dxa" w:w="3213"/>
+          </w:tcPr>
+          <w:p>
+            <w:r>
+              <w:t>Рекомендованное начало</w:t>
+            </w:r>
+          </w:p>
+        </w:tc>
+        <w:tc>
+          <w:tcPr>
+            <w:tcW w:type="dxa" w:w="3213"/>
+          </w:tcPr>
+          <w:p>
+            <w:r>
+              <w:t>Рекомендованное время запуска</w:t>
+            </w:r>
+          </w:p>
+        </w:tc>
+      </w:tr>
+      <w:tr>
+        <w:tc>
+          <w:tcPr>
+            <w:tcW w:type="dxa" w:w="3213"/>
+          </w:tcPr>
+          <w:p>
+            <w:r>
+              <w:t>recommended_end</w:t>
+            </w:r>
+          </w:p>
+        </w:tc>
+        <w:tc>
+          <w:tcPr>
+            <w:tcW w:type="dxa" w:w="3213"/>
+          </w:tcPr>
+          <w:p>
+            <w:r>
+              <w:t>Рекомендованное окончание</w:t>
+            </w:r>
+          </w:p>
+        </w:tc>
+        <w:tc>
+          <w:tcPr>
+            <w:tcW w:type="dxa" w:w="3213"/>
+          </w:tcPr>
+          <w:p>
+            <w:r>
+              <w:t>Рекомендованное время остановки</w:t>
+            </w:r>
+          </w:p>
+        </w:tc>
+      </w:tr>
+      <w:tr>
+        <w:tc>
+          <w:tcPr>
+            <w:tcW w:type="dxa" w:w="3213"/>
+          </w:tcPr>
+          <w:p>
+            <w:r>
+              <w:t>estimated_energy_kwh</w:t>
+            </w:r>
+          </w:p>
+        </w:tc>
+        <w:tc>
+          <w:tcPr>
+            <w:tcW w:type="dxa" w:w="3213"/>
+          </w:tcPr>
+          <w:p>
+            <w:r>
+              <w:t>Энергопотребление</w:t>
+            </w:r>
+          </w:p>
+        </w:tc>
+        <w:tc>
+          <w:tcPr>
+            <w:tcW w:type="dxa" w:w="3213"/>
+          </w:tcPr>
+          <w:p>
+            <w:r>
+              <w:t>Ожидаемое энергопотребление (кВт * ч)</w:t>
+            </w:r>
+          </w:p>
+        </w:tc>
+      </w:tr>
+      <w:tr>
+        <w:tc>
+          <w:tcPr>
+            <w:tcW w:type="dxa" w:w="3213"/>
+          </w:tcPr>
+          <w:p>
+            <w:r>
+              <w:t>estimated_cost</w:t>
+            </w:r>
+          </w:p>
+        </w:tc>
+        <w:tc>
+          <w:tcPr>
+            <w:tcW w:type="dxa" w:w="3213"/>
+          </w:tcPr>
+          <w:p>
+            <w:r>
+              <w:t>Стоимость</w:t>
+            </w:r>
+          </w:p>
+        </w:tc>
+        <w:tc>
+          <w:tcPr>
+            <w:tcW w:type="dxa" w:w="3213"/>
+          </w:tcPr>
+          <w:p>
+            <w:r>
+              <w:t>Ожидаемая стоимость запуска</w:t>
+            </w:r>
+          </w:p>
+        </w:tc>
+      </w:tr>
+      <w:tr>
+        <w:tc>
+          <w:tcPr>
+            <w:tcW w:type="dxa" w:w="3213"/>
+          </w:tcPr>
+          <w:p>
+            <w:r>
+              <w:t>estimated_savings</w:t>
+            </w:r>
+          </w:p>
+        </w:tc>
+        <w:tc>
+          <w:tcPr>
+            <w:tcW w:type="dxa" w:w="3213"/>
+          </w:tcPr>
+          <w:p>
+            <w:r>
+              <w:t>Экономия</w:t>
+            </w:r>
+          </w:p>
+        </w:tc>
+        <w:tc>
+          <w:tcPr>
+            <w:tcW w:type="dxa" w:w="3213"/>
+          </w:tcPr>
+          <w:p>
+            <w:r>
+              <w:t>Экономия относительно базового сценария</w:t>
+            </w:r>
+          </w:p>
+        </w:tc>
+      </w:tr>
+      <w:tr>
+        <w:tc>
+          <w:tcPr>
+            <w:tcW w:type="dxa" w:w="3213"/>
+          </w:tcPr>
+          <w:p>
+            <w:r>
+              <w:t>currency</w:t>
+            </w:r>
+          </w:p>
+        </w:tc>
+        <w:tc>
+          <w:tcPr>
+            <w:tcW w:type="dxa" w:w="3213"/>
+          </w:tcPr>
+          <w:p>
+            <w:r>
+              <w:t>Валюта</w:t>
+            </w:r>
+          </w:p>
+        </w:tc>
+        <w:tc>
+          <w:tcPr>
+            <w:tcW w:type="dxa" w:w="3213"/>
+          </w:tcPr>
+          <w:p>
+            <w:r>
+              <w:t>Валюта расчёта</w:t>
+            </w:r>
+          </w:p>
+        </w:tc>
+      </w:tr>
+      <w:tr>
+        <w:tc>
+          <w:tcPr>
+            <w:tcW w:type="dxa" w:w="3213"/>
+          </w:tcPr>
+          <w:p>
+            <w:r>
+              <w:t>calculated_at</w:t>
+            </w:r>
+          </w:p>
+        </w:tc>
+        <w:tc>
+          <w:tcPr>
+            <w:tcW w:type="dxa" w:w="3213"/>
+          </w:tcPr>
+          <w:p>
+            <w:r>
+              <w:t>Время расчёта</w:t>
+            </w:r>
+          </w:p>
+        </w:tc>
+        <w:tc>
+          <w:tcPr>
+            <w:tcW w:type="dxa" w:w="3213"/>
+          </w:tcPr>
+          <w:p>
+            <w:r>
+              <w:t>Когда была рассчитана рекомендация</w:t>
+            </w:r>
+          </w:p>
+        </w:tc>
+      </w:tr>
+    </w:tbl>
+    <w:p/>
     <w:p>
       <w:pPr>
         <w:spacing w:before="200" w:after="80"/>

</xml_diff>